<commit_message>
docs: remove stale development-stage wording
</commit_message>
<xml_diff>
--- a/设计说明文档.docx
+++ b/设计说明文档.docx
@@ -1251,7 +1251,7 @@
           <w:color w:val="1E1915"/>
           <w:sz w:val="22"/>
         </w:rPr>
-        <w:t>交互设计包含三个层面。第一，ECharts图表支持悬停提示、地图缩放和项目点击，地图选择会联动题材与色彩。第二，固定导航允许用户跳转到“年画中国、百年流变、图必有意、五色成章、版上生花”等章节，滚动进入时通过IntersectionObserver触发淡入和位移动画。第三，p5.js画布提供下拉框、滑杆、按钮与图片导出。手机端不依赖悬停，控件触控区域不小于44像素；系统检测prefers-reduced-motion，在用户要求减少动画时直接显示内容。</w:t>
+        <w:t>交互设计包含三个层面。第一，ECharts图表支持悬停提示、地图缩放和项目点击，地图选择会联动题材与色彩。第二，固定导航允许用户跳转到“年画中国、百年流变、图必有意、五色成章、版上生花”等章节，滚动进入时通过IntersectionObserver触发淡入和位移动画。第三，p5.js画布提供下拉框、滑杆、按钮与图片导出。手机端不依赖悬停，控件触控区域不小于44像素；系统检测prefers-reduced-motion，在检测到减少动态效果设置时直接显示内容。</w:t>
       </w:r>
     </w:p>
     <w:p>
@@ -1389,12 +1389,7 @@
         <w:ind w:left="547" w:hanging="274"/>
       </w:pPr>
       <w:r>
-        <w:rPr>
-          <w:rFonts w:ascii="Microsoft YaHei" w:hAnsi="Microsoft YaHei" w:eastAsia="Microsoft YaHei"/>
-          <w:color w:val="1E1915"/>
-          <w:sz w:val="21"/>
-        </w:rPr>
-        <w:t>poster/：1080×1920展示海报PNG及HTML源文件。</w:t>
+        <w:t>poster/：1080×1920展示海报PNG。</w:t>
       </w:r>
     </w:p>
     <w:p>
@@ -1404,12 +1399,7 @@
         <w:ind w:left="547" w:hanging="274"/>
       </w:pPr>
       <w:r>
-        <w:rPr>
-          <w:rFonts w:ascii="Microsoft YaHei" w:hAnsi="Microsoft YaHei" w:eastAsia="Microsoft YaHei"/>
-          <w:color w:val="1E1915"/>
-          <w:sz w:val="21"/>
-        </w:rPr>
-        <w:t>tests/：数据模型、生成艺术、页面结构、海报与部署共27项自动测试。</w:t>
+        <w:t>数据清洗过程说明文档：记录原始数据、字段转换规则与审计结果。</w:t>
       </w:r>
     </w:p>
     <w:p>

</xml_diff>